<commit_message>
Change title to 'COLDSTART: Using published evidence to forecast health-system crises before local data exist' across plan, letters, notes and RGO inputs
Co-Authored-By: Claude Opus 5.5 <noreply@anthropic.com>
Claude-Session: https://claude.ai/code/session_01Pijyy83JyS8bJxoVQgxwZB
</commit_message>
<xml_diff>
--- a/04-other-documents/lettre-confirmation-isg-SIGNABLE.docx
+++ b/04-other-documents/lettre-confirmation-isg-SIGNABLE.docx
@@ -96,7 +96,7 @@
           <w:bCs/>
           <w:b/>
         </w:rPr>
-        <w:t xml:space="preserve">COLDSTART: Anticipating and</w:t>
+        <w:t xml:space="preserve">COLDSTART: Using published evidence to forecast</w:t>
       </w:r>
       <w:r>
         <w:rPr>
@@ -110,7 +110,7 @@
           <w:bCs/>
           <w:b/>
         </w:rPr>
-        <w:t xml:space="preserve">quantifying health-system crises before the outcome is observable</w:t>
+        <w:t xml:space="preserve">health-system crises before local data exist</w:t>
       </w:r>
       <w:r>
         <w:rPr>

</xml_diff>